<commit_message>
incluyendo EPI de control en los modelos de pheno
</commit_message>
<xml_diff>
--- a/avena_ncbi/tablas_dbRDA.docx
+++ b/avena_ncbi/tablas_dbRDA.docx
@@ -969,7 +969,7 @@
                 <w:szCs w:val="20"/>
                 <w:color w:val="000000"/>
               </w:rPr>
-              <w:t xml:space="preserve">0.438</w:t>
+              <w:t xml:space="preserve">0.443</w:t>
             </w:r>
           </w:p>
         </w:tc>
@@ -2597,7 +2597,7 @@
                 <w:szCs w:val="20"/>
                 <w:color w:val="000000"/>
               </w:rPr>
-              <w:t xml:space="preserve">0.447</w:t>
+              <w:t xml:space="preserve">0.451</w:t>
             </w:r>
           </w:p>
         </w:tc>
@@ -3566,7 +3566,7 @@
                 <w:szCs w:val="20"/>
                 <w:color w:val="000000"/>
               </w:rPr>
-              <w:t xml:space="preserve">0.002**</w:t>
+              <w:t xml:space="preserve">0.001**</w:t>
             </w:r>
           </w:p>
         </w:tc>
@@ -4225,7 +4225,7 @@
                 <w:szCs w:val="20"/>
                 <w:color w:val="000000"/>
               </w:rPr>
-              <w:t xml:space="preserve">0.476</w:t>
+              <w:t xml:space="preserve">0.487</w:t>
             </w:r>
           </w:p>
         </w:tc>
@@ -5853,7 +5853,7 @@
                 <w:szCs w:val="20"/>
                 <w:color w:val="000000"/>
               </w:rPr>
-              <w:t xml:space="preserve">0.348</w:t>
+              <w:t xml:space="preserve">0.352</w:t>
             </w:r>
           </w:p>
         </w:tc>
@@ -7995,7 +7995,7 @@
                 <w:szCs w:val="20"/>
                 <w:color w:val="000000"/>
               </w:rPr>
-              <w:t xml:space="preserve">0.203</w:t>
+              <w:t xml:space="preserve">0.205</w:t>
             </w:r>
           </w:p>
         </w:tc>
@@ -8361,7 +8361,7 @@
                 <w:szCs w:val="20"/>
                 <w:color w:val="000000"/>
               </w:rPr>
-              <w:t xml:space="preserve">0.166</w:t>
+              <w:t xml:space="preserve">0.170</w:t>
             </w:r>
           </w:p>
         </w:tc>
@@ -9106,7 +9106,7 @@
                 <w:szCs w:val="20"/>
                 <w:color w:val="000000"/>
               </w:rPr>
-              <w:t xml:space="preserve">0.192</w:t>
+              <w:t xml:space="preserve">0.188</w:t>
             </w:r>
           </w:p>
         </w:tc>
@@ -9472,7 +9472,7 @@
                 <w:szCs w:val="20"/>
                 <w:color w:val="000000"/>
               </w:rPr>
-              <w:t xml:space="preserve">0.176</w:t>
+              <w:t xml:space="preserve">0.172</w:t>
             </w:r>
           </w:p>
         </w:tc>
@@ -10217,7 +10217,7 @@
                 <w:szCs w:val="20"/>
                 <w:color w:val="000000"/>
               </w:rPr>
-              <w:t xml:space="preserve">0.230</w:t>
+              <w:t xml:space="preserve">0.235</w:t>
             </w:r>
           </w:p>
         </w:tc>
@@ -11328,7 +11328,7 @@
                 <w:szCs w:val="20"/>
                 <w:color w:val="000000"/>
               </w:rPr>
-              <w:t xml:space="preserve">0.186</w:t>
+              <w:t xml:space="preserve">0.184</w:t>
             </w:r>
           </w:p>
         </w:tc>
@@ -11694,7 +11694,7 @@
                 <w:szCs w:val="20"/>
                 <w:color w:val="000000"/>
               </w:rPr>
-              <w:t xml:space="preserve">0.210</w:t>
+              <w:t xml:space="preserve">0.223</w:t>
             </w:r>
           </w:p>
         </w:tc>
@@ -12688,7 +12688,7 @@
                 <w:szCs w:val="20"/>
                 <w:color w:val="000000"/>
               </w:rPr>
-              <w:t xml:space="preserve">PhenoDist ~ M * S</w:t>
+              <w:t xml:space="preserve">PhenoDist ~ GenVar</w:t>
             </w:r>
           </w:p>
         </w:tc>
@@ -12743,7 +12743,7 @@
                 <w:szCs w:val="20"/>
                 <w:color w:val="000000"/>
               </w:rPr>
-              <w:t xml:space="preserve">3</w:t>
+              <w:t xml:space="preserve">1</w:t>
             </w:r>
           </w:p>
         </w:tc>
@@ -12798,7 +12798,7 @@
                 <w:szCs w:val="20"/>
                 <w:color w:val="000000"/>
               </w:rPr>
-              <w:t xml:space="preserve">5.968</w:t>
+              <w:t xml:space="preserve">10.479</w:t>
             </w:r>
           </w:p>
         </w:tc>
@@ -12908,7 +12908,7 @@
                 <w:szCs w:val="20"/>
                 <w:color w:val="000000"/>
               </w:rPr>
-              <w:t xml:space="preserve">0.267</w:t>
+              <w:t xml:space="preserve">0.188</w:t>
             </w:r>
           </w:p>
         </w:tc>
@@ -12920,6 +12920,1406 @@
         <w:tc>
           <w:tcPr>
             <w:tcBorders>
+              <w:bottom w:val="none" w:sz="0" w:space="0" w:color="000000"/>
+              <w:top w:val="none" w:sz="0" w:space="0" w:color="000000"/>
+              <w:left w:val="none" w:sz="0" w:space="0" w:color="000000"/>
+              <w:right w:val="none" w:sz="0" w:space="0" w:color="000000"/>
+            </w:tcBorders>
+            <w:shd w:val="clear" w:color="auto" w:fill="FFFFFF"/>
+            <w:tcMar>
+              <w:top w:w="0" w:type="dxa"/>
+              <w:bottom w:w="0" w:type="dxa"/>
+              <w:left w:w="0" w:type="dxa"/>
+              <w:right w:w="0" w:type="dxa"/>
+            </w:tcMar>
+            <w:vAlign w:val="center"/>
+          </w:tcPr>
+          <w:p>
+            <w:pPr>
+              <w:pStyle w:val="Normal"/>
+              <w:jc w:val="left"/>
+              <w:pBdr>
+                <w:bottom w:val="none" w:sz="0" w:space="0" w:color="000000"/>
+                <w:top w:val="none" w:sz="0" w:space="0" w:color="000000"/>
+                <w:left w:val="none" w:sz="0" w:space="0" w:color="000000"/>
+                <w:right w:val="none" w:sz="0" w:space="0" w:color="000000"/>
+              </w:pBdr>
+              <w:spacing w:after="100" w:before="100" w:line="240"/>
+              <w:ind w:left="100" w:right="100" w:firstLine="0" w:firstLineChars="0"/>
+              <w:rPr>
+                <w:rFonts w:ascii="Arial" w:hAnsi="Arial" w:eastAsia="Arial" w:cs="Arial"/>
+                <w:i w:val="false"/>
+                <w:b w:val="false"/>
+                <w:u w:val="none"/>
+                <w:strike w:val="false"/>
+                <w:sz w:val="20"/>
+                <w:szCs w:val="20"/>
+                <w:color w:val="000000"/>
+              </w:rPr>
+            </w:pPr>
+            <w:r>
+              <w:rPr>
+                <w:rFonts w:ascii="Arial" w:hAnsi="Arial" w:eastAsia="Arial" w:cs="Arial"/>
+                <w:i w:val="false"/>
+                <w:b w:val="false"/>
+                <w:u w:val="none"/>
+                <w:strike w:val="false"/>
+                <w:sz w:val="20"/>
+                <w:szCs w:val="20"/>
+                <w:color w:val="000000"/>
+              </w:rPr>
+              <w:t xml:space="preserve">PhenoDist ~ EpiVar</w:t>
+            </w:r>
+          </w:p>
+        </w:tc>
+        <w:tc>
+          <w:tcPr>
+            <w:tcBorders>
+              <w:bottom w:val="none" w:sz="0" w:space="0" w:color="000000"/>
+              <w:top w:val="none" w:sz="0" w:space="0" w:color="000000"/>
+              <w:left w:val="none" w:sz="0" w:space="0" w:color="000000"/>
+              <w:right w:val="none" w:sz="0" w:space="0" w:color="000000"/>
+            </w:tcBorders>
+            <w:shd w:val="clear" w:color="auto" w:fill="FFFFFF"/>
+            <w:tcMar>
+              <w:top w:w="0" w:type="dxa"/>
+              <w:bottom w:w="0" w:type="dxa"/>
+              <w:left w:w="0" w:type="dxa"/>
+              <w:right w:w="0" w:type="dxa"/>
+            </w:tcMar>
+            <w:vAlign w:val="center"/>
+          </w:tcPr>
+          <w:p>
+            <w:pPr>
+              <w:pStyle w:val="Normal"/>
+              <w:jc w:val="right"/>
+              <w:pBdr>
+                <w:bottom w:val="none" w:sz="0" w:space="0" w:color="000000"/>
+                <w:top w:val="none" w:sz="0" w:space="0" w:color="000000"/>
+                <w:left w:val="none" w:sz="0" w:space="0" w:color="000000"/>
+                <w:right w:val="none" w:sz="0" w:space="0" w:color="000000"/>
+              </w:pBdr>
+              <w:spacing w:after="100" w:before="100" w:line="240"/>
+              <w:ind w:left="100" w:right="100" w:firstLine="0" w:firstLineChars="0"/>
+              <w:rPr>
+                <w:rFonts w:ascii="Arial" w:hAnsi="Arial" w:eastAsia="Arial" w:cs="Arial"/>
+                <w:i w:val="false"/>
+                <w:b w:val="false"/>
+                <w:u w:val="none"/>
+                <w:strike w:val="false"/>
+                <w:sz w:val="20"/>
+                <w:szCs w:val="20"/>
+                <w:color w:val="000000"/>
+              </w:rPr>
+            </w:pPr>
+            <w:r>
+              <w:rPr>
+                <w:rFonts w:ascii="Arial" w:hAnsi="Arial" w:eastAsia="Arial" w:cs="Arial"/>
+                <w:i w:val="false"/>
+                <w:b w:val="false"/>
+                <w:u w:val="none"/>
+                <w:strike w:val="false"/>
+                <w:sz w:val="20"/>
+                <w:szCs w:val="20"/>
+                <w:color w:val="000000"/>
+              </w:rPr>
+              <w:t xml:space="preserve">1</w:t>
+            </w:r>
+          </w:p>
+        </w:tc>
+        <w:tc>
+          <w:tcPr>
+            <w:tcBorders>
+              <w:bottom w:val="none" w:sz="0" w:space="0" w:color="000000"/>
+              <w:top w:val="none" w:sz="0" w:space="0" w:color="000000"/>
+              <w:left w:val="none" w:sz="0" w:space="0" w:color="000000"/>
+              <w:right w:val="none" w:sz="0" w:space="0" w:color="000000"/>
+            </w:tcBorders>
+            <w:shd w:val="clear" w:color="auto" w:fill="FFFFFF"/>
+            <w:tcMar>
+              <w:top w:w="0" w:type="dxa"/>
+              <w:bottom w:w="0" w:type="dxa"/>
+              <w:left w:w="0" w:type="dxa"/>
+              <w:right w:w="0" w:type="dxa"/>
+            </w:tcMar>
+            <w:vAlign w:val="center"/>
+          </w:tcPr>
+          <w:p>
+            <w:pPr>
+              <w:pStyle w:val="Normal"/>
+              <w:jc w:val="right"/>
+              <w:pBdr>
+                <w:bottom w:val="none" w:sz="0" w:space="0" w:color="000000"/>
+                <w:top w:val="none" w:sz="0" w:space="0" w:color="000000"/>
+                <w:left w:val="none" w:sz="0" w:space="0" w:color="000000"/>
+                <w:right w:val="none" w:sz="0" w:space="0" w:color="000000"/>
+              </w:pBdr>
+              <w:spacing w:after="100" w:before="100" w:line="240"/>
+              <w:ind w:left="100" w:right="100" w:firstLine="0" w:firstLineChars="0"/>
+              <w:rPr>
+                <w:rFonts w:ascii="Arial" w:hAnsi="Arial" w:eastAsia="Arial" w:cs="Arial"/>
+                <w:i w:val="false"/>
+                <w:b w:val="false"/>
+                <w:u w:val="none"/>
+                <w:strike w:val="false"/>
+                <w:sz w:val="20"/>
+                <w:szCs w:val="20"/>
+                <w:color w:val="000000"/>
+              </w:rPr>
+            </w:pPr>
+            <w:r>
+              <w:rPr>
+                <w:rFonts w:ascii="Arial" w:hAnsi="Arial" w:eastAsia="Arial" w:cs="Arial"/>
+                <w:i w:val="false"/>
+                <w:b w:val="false"/>
+                <w:u w:val="none"/>
+                <w:strike w:val="false"/>
+                <w:sz w:val="20"/>
+                <w:szCs w:val="20"/>
+                <w:color w:val="000000"/>
+              </w:rPr>
+              <w:t xml:space="preserve">1.558</w:t>
+            </w:r>
+          </w:p>
+        </w:tc>
+        <w:tc>
+          <w:tcPr>
+            <w:tcBorders>
+              <w:bottom w:val="none" w:sz="0" w:space="0" w:color="000000"/>
+              <w:top w:val="none" w:sz="0" w:space="0" w:color="000000"/>
+              <w:left w:val="none" w:sz="0" w:space="0" w:color="000000"/>
+              <w:right w:val="none" w:sz="0" w:space="0" w:color="000000"/>
+            </w:tcBorders>
+            <w:shd w:val="clear" w:color="auto" w:fill="FFFFFF"/>
+            <w:tcMar>
+              <w:top w:w="0" w:type="dxa"/>
+              <w:bottom w:w="0" w:type="dxa"/>
+              <w:left w:w="0" w:type="dxa"/>
+              <w:right w:w="0" w:type="dxa"/>
+            </w:tcMar>
+            <w:vAlign w:val="center"/>
+          </w:tcPr>
+          <w:p>
+            <w:pPr>
+              <w:pStyle w:val="Normal"/>
+              <w:jc w:val="left"/>
+              <w:pBdr>
+                <w:bottom w:val="none" w:sz="0" w:space="0" w:color="000000"/>
+                <w:top w:val="none" w:sz="0" w:space="0" w:color="000000"/>
+                <w:left w:val="none" w:sz="0" w:space="0" w:color="000000"/>
+                <w:right w:val="none" w:sz="0" w:space="0" w:color="000000"/>
+              </w:pBdr>
+              <w:spacing w:after="100" w:before="100" w:line="240"/>
+              <w:ind w:left="100" w:right="100" w:firstLine="0" w:firstLineChars="0"/>
+              <w:rPr>
+                <w:rFonts w:ascii="Arial" w:hAnsi="Arial" w:eastAsia="Arial" w:cs="Arial"/>
+                <w:i w:val="false"/>
+                <w:b w:val="false"/>
+                <w:u w:val="none"/>
+                <w:strike w:val="false"/>
+                <w:sz w:val="20"/>
+                <w:szCs w:val="20"/>
+                <w:color w:val="000000"/>
+              </w:rPr>
+            </w:pPr>
+            <w:r>
+              <w:rPr>
+                <w:rFonts w:ascii="Arial" w:hAnsi="Arial" w:eastAsia="Arial" w:cs="Arial"/>
+                <w:i w:val="false"/>
+                <w:b w:val="false"/>
+                <w:u w:val="none"/>
+                <w:strike w:val="false"/>
+                <w:sz w:val="20"/>
+                <w:szCs w:val="20"/>
+                <w:color w:val="000000"/>
+              </w:rPr>
+              <w:t xml:space="preserve">0.138</w:t>
+            </w:r>
+          </w:p>
+        </w:tc>
+        <w:tc>
+          <w:tcPr>
+            <w:tcBorders>
+              <w:bottom w:val="none" w:sz="0" w:space="0" w:color="000000"/>
+              <w:top w:val="none" w:sz="0" w:space="0" w:color="000000"/>
+              <w:left w:val="none" w:sz="0" w:space="0" w:color="000000"/>
+              <w:right w:val="none" w:sz="0" w:space="0" w:color="000000"/>
+            </w:tcBorders>
+            <w:shd w:val="clear" w:color="auto" w:fill="FFFFFF"/>
+            <w:tcMar>
+              <w:top w:w="0" w:type="dxa"/>
+              <w:bottom w:w="0" w:type="dxa"/>
+              <w:left w:w="0" w:type="dxa"/>
+              <w:right w:w="0" w:type="dxa"/>
+            </w:tcMar>
+            <w:vAlign w:val="center"/>
+          </w:tcPr>
+          <w:p>
+            <w:pPr>
+              <w:pStyle w:val="Normal"/>
+              <w:jc w:val="right"/>
+              <w:pBdr>
+                <w:bottom w:val="none" w:sz="0" w:space="0" w:color="000000"/>
+                <w:top w:val="none" w:sz="0" w:space="0" w:color="000000"/>
+                <w:left w:val="none" w:sz="0" w:space="0" w:color="000000"/>
+                <w:right w:val="none" w:sz="0" w:space="0" w:color="000000"/>
+              </w:pBdr>
+              <w:spacing w:after="100" w:before="100" w:line="240"/>
+              <w:ind w:left="100" w:right="100" w:firstLine="0" w:firstLineChars="0"/>
+              <w:rPr>
+                <w:rFonts w:ascii="Arial" w:hAnsi="Arial" w:eastAsia="Arial" w:cs="Arial"/>
+                <w:i w:val="false"/>
+                <w:b w:val="false"/>
+                <w:u w:val="none"/>
+                <w:strike w:val="false"/>
+                <w:sz w:val="20"/>
+                <w:szCs w:val="20"/>
+                <w:color w:val="000000"/>
+              </w:rPr>
+            </w:pPr>
+            <w:r>
+              <w:rPr>
+                <w:rFonts w:ascii="Arial" w:hAnsi="Arial" w:eastAsia="Arial" w:cs="Arial"/>
+                <w:i w:val="false"/>
+                <w:b w:val="false"/>
+                <w:u w:val="none"/>
+                <w:strike w:val="false"/>
+                <w:sz w:val="20"/>
+                <w:szCs w:val="20"/>
+                <w:color w:val="000000"/>
+              </w:rPr>
+              <w:t xml:space="preserve">0.013</w:t>
+            </w:r>
+          </w:p>
+        </w:tc>
+      </w:tr>
+      <w:tr>
+        <w:trPr>
+          <w:trHeight w:val="360" w:hRule="auto"/>
+        </w:trPr>
+        <w:tc>
+          <w:tcPr>
+            <w:tcBorders>
+              <w:bottom w:val="none" w:sz="0" w:space="0" w:color="000000"/>
+              <w:top w:val="none" w:sz="0" w:space="0" w:color="000000"/>
+              <w:left w:val="none" w:sz="0" w:space="0" w:color="000000"/>
+              <w:right w:val="none" w:sz="0" w:space="0" w:color="000000"/>
+            </w:tcBorders>
+            <w:shd w:val="clear" w:color="auto" w:fill="FFFFFF"/>
+            <w:tcMar>
+              <w:top w:w="0" w:type="dxa"/>
+              <w:bottom w:w="0" w:type="dxa"/>
+              <w:left w:w="0" w:type="dxa"/>
+              <w:right w:w="0" w:type="dxa"/>
+            </w:tcMar>
+            <w:vAlign w:val="center"/>
+          </w:tcPr>
+          <w:p>
+            <w:pPr>
+              <w:pStyle w:val="Normal"/>
+              <w:jc w:val="left"/>
+              <w:pBdr>
+                <w:bottom w:val="none" w:sz="0" w:space="0" w:color="000000"/>
+                <w:top w:val="none" w:sz="0" w:space="0" w:color="000000"/>
+                <w:left w:val="none" w:sz="0" w:space="0" w:color="000000"/>
+                <w:right w:val="none" w:sz="0" w:space="0" w:color="000000"/>
+              </w:pBdr>
+              <w:spacing w:after="100" w:before="100" w:line="240"/>
+              <w:ind w:left="100" w:right="100" w:firstLine="0" w:firstLineChars="0"/>
+              <w:rPr>
+                <w:rFonts w:ascii="Arial" w:hAnsi="Arial" w:eastAsia="Arial" w:cs="Arial"/>
+                <w:i w:val="false"/>
+                <w:b w:val="false"/>
+                <w:u w:val="none"/>
+                <w:strike w:val="false"/>
+                <w:sz w:val="20"/>
+                <w:szCs w:val="20"/>
+                <w:color w:val="000000"/>
+              </w:rPr>
+            </w:pPr>
+            <w:r>
+              <w:rPr>
+                <w:rFonts w:ascii="Arial" w:hAnsi="Arial" w:eastAsia="Arial" w:cs="Arial"/>
+                <w:i w:val="false"/>
+                <w:b w:val="false"/>
+                <w:u w:val="none"/>
+                <w:strike w:val="false"/>
+                <w:sz w:val="20"/>
+                <w:szCs w:val="20"/>
+                <w:color w:val="000000"/>
+              </w:rPr>
+              <w:t xml:space="preserve">PhenoDist ~ M * S</w:t>
+            </w:r>
+          </w:p>
+        </w:tc>
+        <w:tc>
+          <w:tcPr>
+            <w:tcBorders>
+              <w:bottom w:val="none" w:sz="0" w:space="0" w:color="000000"/>
+              <w:top w:val="none" w:sz="0" w:space="0" w:color="000000"/>
+              <w:left w:val="none" w:sz="0" w:space="0" w:color="000000"/>
+              <w:right w:val="none" w:sz="0" w:space="0" w:color="000000"/>
+            </w:tcBorders>
+            <w:shd w:val="clear" w:color="auto" w:fill="FFFFFF"/>
+            <w:tcMar>
+              <w:top w:w="0" w:type="dxa"/>
+              <w:bottom w:w="0" w:type="dxa"/>
+              <w:left w:w="0" w:type="dxa"/>
+              <w:right w:w="0" w:type="dxa"/>
+            </w:tcMar>
+            <w:vAlign w:val="center"/>
+          </w:tcPr>
+          <w:p>
+            <w:pPr>
+              <w:pStyle w:val="Normal"/>
+              <w:jc w:val="right"/>
+              <w:pBdr>
+                <w:bottom w:val="none" w:sz="0" w:space="0" w:color="000000"/>
+                <w:top w:val="none" w:sz="0" w:space="0" w:color="000000"/>
+                <w:left w:val="none" w:sz="0" w:space="0" w:color="000000"/>
+                <w:right w:val="none" w:sz="0" w:space="0" w:color="000000"/>
+              </w:pBdr>
+              <w:spacing w:after="100" w:before="100" w:line="240"/>
+              <w:ind w:left="100" w:right="100" w:firstLine="0" w:firstLineChars="0"/>
+              <w:rPr>
+                <w:rFonts w:ascii="Arial" w:hAnsi="Arial" w:eastAsia="Arial" w:cs="Arial"/>
+                <w:i w:val="false"/>
+                <w:b w:val="false"/>
+                <w:u w:val="none"/>
+                <w:strike w:val="false"/>
+                <w:sz w:val="20"/>
+                <w:szCs w:val="20"/>
+                <w:color w:val="000000"/>
+              </w:rPr>
+            </w:pPr>
+            <w:r>
+              <w:rPr>
+                <w:rFonts w:ascii="Arial" w:hAnsi="Arial" w:eastAsia="Arial" w:cs="Arial"/>
+                <w:i w:val="false"/>
+                <w:b w:val="false"/>
+                <w:u w:val="none"/>
+                <w:strike w:val="false"/>
+                <w:sz w:val="20"/>
+                <w:szCs w:val="20"/>
+                <w:color w:val="000000"/>
+              </w:rPr>
+              <w:t xml:space="preserve">3</w:t>
+            </w:r>
+          </w:p>
+        </w:tc>
+        <w:tc>
+          <w:tcPr>
+            <w:tcBorders>
+              <w:bottom w:val="none" w:sz="0" w:space="0" w:color="000000"/>
+              <w:top w:val="none" w:sz="0" w:space="0" w:color="000000"/>
+              <w:left w:val="none" w:sz="0" w:space="0" w:color="000000"/>
+              <w:right w:val="none" w:sz="0" w:space="0" w:color="000000"/>
+            </w:tcBorders>
+            <w:shd w:val="clear" w:color="auto" w:fill="FFFFFF"/>
+            <w:tcMar>
+              <w:top w:w="0" w:type="dxa"/>
+              <w:bottom w:w="0" w:type="dxa"/>
+              <w:left w:w="0" w:type="dxa"/>
+              <w:right w:w="0" w:type="dxa"/>
+            </w:tcMar>
+            <w:vAlign w:val="center"/>
+          </w:tcPr>
+          <w:p>
+            <w:pPr>
+              <w:pStyle w:val="Normal"/>
+              <w:jc w:val="right"/>
+              <w:pBdr>
+                <w:bottom w:val="none" w:sz="0" w:space="0" w:color="000000"/>
+                <w:top w:val="none" w:sz="0" w:space="0" w:color="000000"/>
+                <w:left w:val="none" w:sz="0" w:space="0" w:color="000000"/>
+                <w:right w:val="none" w:sz="0" w:space="0" w:color="000000"/>
+              </w:pBdr>
+              <w:spacing w:after="100" w:before="100" w:line="240"/>
+              <w:ind w:left="100" w:right="100" w:firstLine="0" w:firstLineChars="0"/>
+              <w:rPr>
+                <w:rFonts w:ascii="Arial" w:hAnsi="Arial" w:eastAsia="Arial" w:cs="Arial"/>
+                <w:i w:val="false"/>
+                <w:b w:val="false"/>
+                <w:u w:val="none"/>
+                <w:strike w:val="false"/>
+                <w:sz w:val="20"/>
+                <w:szCs w:val="20"/>
+                <w:color w:val="000000"/>
+              </w:rPr>
+            </w:pPr>
+            <w:r>
+              <w:rPr>
+                <w:rFonts w:ascii="Arial" w:hAnsi="Arial" w:eastAsia="Arial" w:cs="Arial"/>
+                <w:i w:val="false"/>
+                <w:b w:val="false"/>
+                <w:u w:val="none"/>
+                <w:strike w:val="false"/>
+                <w:sz w:val="20"/>
+                <w:szCs w:val="20"/>
+                <w:color w:val="000000"/>
+              </w:rPr>
+              <w:t xml:space="preserve">5.968</w:t>
+            </w:r>
+          </w:p>
+        </w:tc>
+        <w:tc>
+          <w:tcPr>
+            <w:tcBorders>
+              <w:bottom w:val="none" w:sz="0" w:space="0" w:color="000000"/>
+              <w:top w:val="none" w:sz="0" w:space="0" w:color="000000"/>
+              <w:left w:val="none" w:sz="0" w:space="0" w:color="000000"/>
+              <w:right w:val="none" w:sz="0" w:space="0" w:color="000000"/>
+            </w:tcBorders>
+            <w:shd w:val="clear" w:color="auto" w:fill="FFFFFF"/>
+            <w:tcMar>
+              <w:top w:w="0" w:type="dxa"/>
+              <w:bottom w:w="0" w:type="dxa"/>
+              <w:left w:w="0" w:type="dxa"/>
+              <w:right w:w="0" w:type="dxa"/>
+            </w:tcMar>
+            <w:vAlign w:val="center"/>
+          </w:tcPr>
+          <w:p>
+            <w:pPr>
+              <w:pStyle w:val="Normal"/>
+              <w:jc w:val="left"/>
+              <w:pBdr>
+                <w:bottom w:val="none" w:sz="0" w:space="0" w:color="000000"/>
+                <w:top w:val="none" w:sz="0" w:space="0" w:color="000000"/>
+                <w:left w:val="none" w:sz="0" w:space="0" w:color="000000"/>
+                <w:right w:val="none" w:sz="0" w:space="0" w:color="000000"/>
+              </w:pBdr>
+              <w:spacing w:after="100" w:before="100" w:line="240"/>
+              <w:ind w:left="100" w:right="100" w:firstLine="0" w:firstLineChars="0"/>
+              <w:rPr>
+                <w:rFonts w:ascii="Arial" w:hAnsi="Arial" w:eastAsia="Arial" w:cs="Arial"/>
+                <w:i w:val="false"/>
+                <w:b w:val="false"/>
+                <w:u w:val="none"/>
+                <w:strike w:val="false"/>
+                <w:sz w:val="20"/>
+                <w:szCs w:val="20"/>
+                <w:color w:val="000000"/>
+              </w:rPr>
+            </w:pPr>
+            <w:r>
+              <w:rPr>
+                <w:rFonts w:ascii="Arial" w:hAnsi="Arial" w:eastAsia="Arial" w:cs="Arial"/>
+                <w:i w:val="false"/>
+                <w:b w:val="false"/>
+                <w:u w:val="none"/>
+                <w:strike w:val="false"/>
+                <w:sz w:val="20"/>
+                <w:szCs w:val="20"/>
+                <w:color w:val="000000"/>
+              </w:rPr>
+              <w:t xml:space="preserve">&lt;0.001***</w:t>
+            </w:r>
+          </w:p>
+        </w:tc>
+        <w:tc>
+          <w:tcPr>
+            <w:tcBorders>
+              <w:bottom w:val="none" w:sz="0" w:space="0" w:color="000000"/>
+              <w:top w:val="none" w:sz="0" w:space="0" w:color="000000"/>
+              <w:left w:val="none" w:sz="0" w:space="0" w:color="000000"/>
+              <w:right w:val="none" w:sz="0" w:space="0" w:color="000000"/>
+            </w:tcBorders>
+            <w:shd w:val="clear" w:color="auto" w:fill="FFFFFF"/>
+            <w:tcMar>
+              <w:top w:w="0" w:type="dxa"/>
+              <w:bottom w:w="0" w:type="dxa"/>
+              <w:left w:w="0" w:type="dxa"/>
+              <w:right w:w="0" w:type="dxa"/>
+            </w:tcMar>
+            <w:vAlign w:val="center"/>
+          </w:tcPr>
+          <w:p>
+            <w:pPr>
+              <w:pStyle w:val="Normal"/>
+              <w:jc w:val="right"/>
+              <w:pBdr>
+                <w:bottom w:val="none" w:sz="0" w:space="0" w:color="000000"/>
+                <w:top w:val="none" w:sz="0" w:space="0" w:color="000000"/>
+                <w:left w:val="none" w:sz="0" w:space="0" w:color="000000"/>
+                <w:right w:val="none" w:sz="0" w:space="0" w:color="000000"/>
+              </w:pBdr>
+              <w:spacing w:after="100" w:before="100" w:line="240"/>
+              <w:ind w:left="100" w:right="100" w:firstLine="0" w:firstLineChars="0"/>
+              <w:rPr>
+                <w:rFonts w:ascii="Arial" w:hAnsi="Arial" w:eastAsia="Arial" w:cs="Arial"/>
+                <w:i w:val="false"/>
+                <w:b w:val="false"/>
+                <w:u w:val="none"/>
+                <w:strike w:val="false"/>
+                <w:sz w:val="20"/>
+                <w:szCs w:val="20"/>
+                <w:color w:val="000000"/>
+              </w:rPr>
+            </w:pPr>
+            <w:r>
+              <w:rPr>
+                <w:rFonts w:ascii="Arial" w:hAnsi="Arial" w:eastAsia="Arial" w:cs="Arial"/>
+                <w:i w:val="false"/>
+                <w:b w:val="false"/>
+                <w:u w:val="none"/>
+                <w:strike w:val="false"/>
+                <w:sz w:val="20"/>
+                <w:szCs w:val="20"/>
+                <w:color w:val="000000"/>
+              </w:rPr>
+              <w:t xml:space="preserve">0.267</w:t>
+            </w:r>
+          </w:p>
+        </w:tc>
+      </w:tr>
+      <w:tr>
+        <w:trPr>
+          <w:trHeight w:val="360" w:hRule="auto"/>
+        </w:trPr>
+        <w:tc>
+          <w:tcPr>
+            <w:tcBorders>
+              <w:bottom w:val="none" w:sz="0" w:space="0" w:color="000000"/>
+              <w:top w:val="none" w:sz="0" w:space="0" w:color="000000"/>
+              <w:left w:val="none" w:sz="0" w:space="0" w:color="000000"/>
+              <w:right w:val="none" w:sz="0" w:space="0" w:color="000000"/>
+            </w:tcBorders>
+            <w:shd w:val="clear" w:color="auto" w:fill="FFFFFF"/>
+            <w:tcMar>
+              <w:top w:w="0" w:type="dxa"/>
+              <w:bottom w:w="0" w:type="dxa"/>
+              <w:left w:w="0" w:type="dxa"/>
+              <w:right w:w="0" w:type="dxa"/>
+            </w:tcMar>
+            <w:vAlign w:val="center"/>
+          </w:tcPr>
+          <w:p>
+            <w:pPr>
+              <w:pStyle w:val="Normal"/>
+              <w:jc w:val="left"/>
+              <w:pBdr>
+                <w:bottom w:val="none" w:sz="0" w:space="0" w:color="000000"/>
+                <w:top w:val="none" w:sz="0" w:space="0" w:color="000000"/>
+                <w:left w:val="none" w:sz="0" w:space="0" w:color="000000"/>
+                <w:right w:val="none" w:sz="0" w:space="0" w:color="000000"/>
+              </w:pBdr>
+              <w:spacing w:after="100" w:before="100" w:line="240"/>
+              <w:ind w:left="100" w:right="100" w:firstLine="0" w:firstLineChars="0"/>
+              <w:rPr>
+                <w:rFonts w:ascii="Arial" w:hAnsi="Arial" w:eastAsia="Arial" w:cs="Arial"/>
+                <w:i w:val="false"/>
+                <w:b w:val="false"/>
+                <w:u w:val="none"/>
+                <w:strike w:val="false"/>
+                <w:sz w:val="20"/>
+                <w:szCs w:val="20"/>
+                <w:color w:val="000000"/>
+              </w:rPr>
+            </w:pPr>
+            <w:r>
+              <w:rPr>
+                <w:rFonts w:ascii="Arial" w:hAnsi="Arial" w:eastAsia="Arial" w:cs="Arial"/>
+                <w:i w:val="false"/>
+                <w:b w:val="false"/>
+                <w:u w:val="none"/>
+                <w:strike w:val="false"/>
+                <w:sz w:val="20"/>
+                <w:szCs w:val="20"/>
+                <w:color w:val="000000"/>
+              </w:rPr>
+              <w:t xml:space="preserve">PhenoDist ~ M * S + Condition(GenVar)</w:t>
+            </w:r>
+          </w:p>
+        </w:tc>
+        <w:tc>
+          <w:tcPr>
+            <w:tcBorders>
+              <w:bottom w:val="none" w:sz="0" w:space="0" w:color="000000"/>
+              <w:top w:val="none" w:sz="0" w:space="0" w:color="000000"/>
+              <w:left w:val="none" w:sz="0" w:space="0" w:color="000000"/>
+              <w:right w:val="none" w:sz="0" w:space="0" w:color="000000"/>
+            </w:tcBorders>
+            <w:shd w:val="clear" w:color="auto" w:fill="FFFFFF"/>
+            <w:tcMar>
+              <w:top w:w="0" w:type="dxa"/>
+              <w:bottom w:w="0" w:type="dxa"/>
+              <w:left w:w="0" w:type="dxa"/>
+              <w:right w:w="0" w:type="dxa"/>
+            </w:tcMar>
+            <w:vAlign w:val="center"/>
+          </w:tcPr>
+          <w:p>
+            <w:pPr>
+              <w:pStyle w:val="Normal"/>
+              <w:jc w:val="right"/>
+              <w:pBdr>
+                <w:bottom w:val="none" w:sz="0" w:space="0" w:color="000000"/>
+                <w:top w:val="none" w:sz="0" w:space="0" w:color="000000"/>
+                <w:left w:val="none" w:sz="0" w:space="0" w:color="000000"/>
+                <w:right w:val="none" w:sz="0" w:space="0" w:color="000000"/>
+              </w:pBdr>
+              <w:spacing w:after="100" w:before="100" w:line="240"/>
+              <w:ind w:left="100" w:right="100" w:firstLine="0" w:firstLineChars="0"/>
+              <w:rPr>
+                <w:rFonts w:ascii="Arial" w:hAnsi="Arial" w:eastAsia="Arial" w:cs="Arial"/>
+                <w:i w:val="false"/>
+                <w:b w:val="false"/>
+                <w:u w:val="none"/>
+                <w:strike w:val="false"/>
+                <w:sz w:val="20"/>
+                <w:szCs w:val="20"/>
+                <w:color w:val="000000"/>
+              </w:rPr>
+            </w:pPr>
+            <w:r>
+              <w:rPr>
+                <w:rFonts w:ascii="Arial" w:hAnsi="Arial" w:eastAsia="Arial" w:cs="Arial"/>
+                <w:i w:val="false"/>
+                <w:b w:val="false"/>
+                <w:u w:val="none"/>
+                <w:strike w:val="false"/>
+                <w:sz w:val="20"/>
+                <w:szCs w:val="20"/>
+                <w:color w:val="000000"/>
+              </w:rPr>
+              <w:t xml:space="preserve">3</w:t>
+            </w:r>
+          </w:p>
+        </w:tc>
+        <w:tc>
+          <w:tcPr>
+            <w:tcBorders>
+              <w:bottom w:val="none" w:sz="0" w:space="0" w:color="000000"/>
+              <w:top w:val="none" w:sz="0" w:space="0" w:color="000000"/>
+              <w:left w:val="none" w:sz="0" w:space="0" w:color="000000"/>
+              <w:right w:val="none" w:sz="0" w:space="0" w:color="000000"/>
+            </w:tcBorders>
+            <w:shd w:val="clear" w:color="auto" w:fill="FFFFFF"/>
+            <w:tcMar>
+              <w:top w:w="0" w:type="dxa"/>
+              <w:bottom w:w="0" w:type="dxa"/>
+              <w:left w:w="0" w:type="dxa"/>
+              <w:right w:w="0" w:type="dxa"/>
+            </w:tcMar>
+            <w:vAlign w:val="center"/>
+          </w:tcPr>
+          <w:p>
+            <w:pPr>
+              <w:pStyle w:val="Normal"/>
+              <w:jc w:val="right"/>
+              <w:pBdr>
+                <w:bottom w:val="none" w:sz="0" w:space="0" w:color="000000"/>
+                <w:top w:val="none" w:sz="0" w:space="0" w:color="000000"/>
+                <w:left w:val="none" w:sz="0" w:space="0" w:color="000000"/>
+                <w:right w:val="none" w:sz="0" w:space="0" w:color="000000"/>
+              </w:pBdr>
+              <w:spacing w:after="100" w:before="100" w:line="240"/>
+              <w:ind w:left="100" w:right="100" w:firstLine="0" w:firstLineChars="0"/>
+              <w:rPr>
+                <w:rFonts w:ascii="Arial" w:hAnsi="Arial" w:eastAsia="Arial" w:cs="Arial"/>
+                <w:i w:val="false"/>
+                <w:b w:val="false"/>
+                <w:u w:val="none"/>
+                <w:strike w:val="false"/>
+                <w:sz w:val="20"/>
+                <w:szCs w:val="20"/>
+                <w:color w:val="000000"/>
+              </w:rPr>
+            </w:pPr>
+            <w:r>
+              <w:rPr>
+                <w:rFonts w:ascii="Arial" w:hAnsi="Arial" w:eastAsia="Arial" w:cs="Arial"/>
+                <w:i w:val="false"/>
+                <w:b w:val="false"/>
+                <w:u w:val="none"/>
+                <w:strike w:val="false"/>
+                <w:sz w:val="20"/>
+                <w:szCs w:val="20"/>
+                <w:color w:val="000000"/>
+              </w:rPr>
+              <w:t xml:space="preserve">2.212</w:t>
+            </w:r>
+          </w:p>
+        </w:tc>
+        <w:tc>
+          <w:tcPr>
+            <w:tcBorders>
+              <w:bottom w:val="none" w:sz="0" w:space="0" w:color="000000"/>
+              <w:top w:val="none" w:sz="0" w:space="0" w:color="000000"/>
+              <w:left w:val="none" w:sz="0" w:space="0" w:color="000000"/>
+              <w:right w:val="none" w:sz="0" w:space="0" w:color="000000"/>
+            </w:tcBorders>
+            <w:shd w:val="clear" w:color="auto" w:fill="FFFFFF"/>
+            <w:tcMar>
+              <w:top w:w="0" w:type="dxa"/>
+              <w:bottom w:w="0" w:type="dxa"/>
+              <w:left w:w="0" w:type="dxa"/>
+              <w:right w:w="0" w:type="dxa"/>
+            </w:tcMar>
+            <w:vAlign w:val="center"/>
+          </w:tcPr>
+          <w:p>
+            <w:pPr>
+              <w:pStyle w:val="Normal"/>
+              <w:jc w:val="left"/>
+              <w:pBdr>
+                <w:bottom w:val="none" w:sz="0" w:space="0" w:color="000000"/>
+                <w:top w:val="none" w:sz="0" w:space="0" w:color="000000"/>
+                <w:left w:val="none" w:sz="0" w:space="0" w:color="000000"/>
+                <w:right w:val="none" w:sz="0" w:space="0" w:color="000000"/>
+              </w:pBdr>
+              <w:spacing w:after="100" w:before="100" w:line="240"/>
+              <w:ind w:left="100" w:right="100" w:firstLine="0" w:firstLineChars="0"/>
+              <w:rPr>
+                <w:rFonts w:ascii="Arial" w:hAnsi="Arial" w:eastAsia="Arial" w:cs="Arial"/>
+                <w:i w:val="false"/>
+                <w:b w:val="false"/>
+                <w:u w:val="none"/>
+                <w:strike w:val="false"/>
+                <w:sz w:val="20"/>
+                <w:szCs w:val="20"/>
+                <w:color w:val="000000"/>
+              </w:rPr>
+            </w:pPr>
+            <w:r>
+              <w:rPr>
+                <w:rFonts w:ascii="Arial" w:hAnsi="Arial" w:eastAsia="Arial" w:cs="Arial"/>
+                <w:i w:val="false"/>
+                <w:b w:val="false"/>
+                <w:u w:val="none"/>
+                <w:strike w:val="false"/>
+                <w:sz w:val="20"/>
+                <w:szCs w:val="20"/>
+                <w:color w:val="000000"/>
+              </w:rPr>
+              <w:t xml:space="preserve">&lt;0.001***</w:t>
+            </w:r>
+          </w:p>
+        </w:tc>
+        <w:tc>
+          <w:tcPr>
+            <w:tcBorders>
+              <w:bottom w:val="none" w:sz="0" w:space="0" w:color="000000"/>
+              <w:top w:val="none" w:sz="0" w:space="0" w:color="000000"/>
+              <w:left w:val="none" w:sz="0" w:space="0" w:color="000000"/>
+              <w:right w:val="none" w:sz="0" w:space="0" w:color="000000"/>
+            </w:tcBorders>
+            <w:shd w:val="clear" w:color="auto" w:fill="FFFFFF"/>
+            <w:tcMar>
+              <w:top w:w="0" w:type="dxa"/>
+              <w:bottom w:w="0" w:type="dxa"/>
+              <w:left w:w="0" w:type="dxa"/>
+              <w:right w:w="0" w:type="dxa"/>
+            </w:tcMar>
+            <w:vAlign w:val="center"/>
+          </w:tcPr>
+          <w:p>
+            <w:pPr>
+              <w:pStyle w:val="Normal"/>
+              <w:jc w:val="right"/>
+              <w:pBdr>
+                <w:bottom w:val="none" w:sz="0" w:space="0" w:color="000000"/>
+                <w:top w:val="none" w:sz="0" w:space="0" w:color="000000"/>
+                <w:left w:val="none" w:sz="0" w:space="0" w:color="000000"/>
+                <w:right w:val="none" w:sz="0" w:space="0" w:color="000000"/>
+              </w:pBdr>
+              <w:spacing w:after="100" w:before="100" w:line="240"/>
+              <w:ind w:left="100" w:right="100" w:firstLine="0" w:firstLineChars="0"/>
+              <w:rPr>
+                <w:rFonts w:ascii="Arial" w:hAnsi="Arial" w:eastAsia="Arial" w:cs="Arial"/>
+                <w:i w:val="false"/>
+                <w:b w:val="false"/>
+                <w:u w:val="none"/>
+                <w:strike w:val="false"/>
+                <w:sz w:val="20"/>
+                <w:szCs w:val="20"/>
+                <w:color w:val="000000"/>
+              </w:rPr>
+            </w:pPr>
+            <w:r>
+              <w:rPr>
+                <w:rFonts w:ascii="Arial" w:hAnsi="Arial" w:eastAsia="Arial" w:cs="Arial"/>
+                <w:i w:val="false"/>
+                <w:b w:val="false"/>
+                <w:u w:val="none"/>
+                <w:strike w:val="false"/>
+                <w:sz w:val="20"/>
+                <w:szCs w:val="20"/>
+                <w:color w:val="000000"/>
+              </w:rPr>
+              <w:t xml:space="preserve">0.070</w:t>
+            </w:r>
+          </w:p>
+        </w:tc>
+      </w:tr>
+      <w:tr>
+        <w:trPr>
+          <w:trHeight w:val="360" w:hRule="auto"/>
+        </w:trPr>
+        <w:tc>
+          <w:tcPr>
+            <w:tcBorders>
+              <w:bottom w:val="none" w:sz="0" w:space="0" w:color="000000"/>
+              <w:top w:val="none" w:sz="0" w:space="0" w:color="000000"/>
+              <w:left w:val="none" w:sz="0" w:space="0" w:color="000000"/>
+              <w:right w:val="none" w:sz="0" w:space="0" w:color="000000"/>
+            </w:tcBorders>
+            <w:shd w:val="clear" w:color="auto" w:fill="FFFFFF"/>
+            <w:tcMar>
+              <w:top w:w="0" w:type="dxa"/>
+              <w:bottom w:w="0" w:type="dxa"/>
+              <w:left w:w="0" w:type="dxa"/>
+              <w:right w:w="0" w:type="dxa"/>
+            </w:tcMar>
+            <w:vAlign w:val="center"/>
+          </w:tcPr>
+          <w:p>
+            <w:pPr>
+              <w:pStyle w:val="Normal"/>
+              <w:jc w:val="left"/>
+              <w:pBdr>
+                <w:bottom w:val="none" w:sz="0" w:space="0" w:color="000000"/>
+                <w:top w:val="none" w:sz="0" w:space="0" w:color="000000"/>
+                <w:left w:val="none" w:sz="0" w:space="0" w:color="000000"/>
+                <w:right w:val="none" w:sz="0" w:space="0" w:color="000000"/>
+              </w:pBdr>
+              <w:spacing w:after="100" w:before="100" w:line="240"/>
+              <w:ind w:left="100" w:right="100" w:firstLine="0" w:firstLineChars="0"/>
+              <w:rPr>
+                <w:rFonts w:ascii="Arial" w:hAnsi="Arial" w:eastAsia="Arial" w:cs="Arial"/>
+                <w:i w:val="false"/>
+                <w:b w:val="false"/>
+                <w:u w:val="none"/>
+                <w:strike w:val="false"/>
+                <w:sz w:val="20"/>
+                <w:szCs w:val="20"/>
+                <w:color w:val="000000"/>
+              </w:rPr>
+            </w:pPr>
+            <w:r>
+              <w:rPr>
+                <w:rFonts w:ascii="Arial" w:hAnsi="Arial" w:eastAsia="Arial" w:cs="Arial"/>
+                <w:i w:val="false"/>
+                <w:b w:val="false"/>
+                <w:u w:val="none"/>
+                <w:strike w:val="false"/>
+                <w:sz w:val="20"/>
+                <w:szCs w:val="20"/>
+                <w:color w:val="000000"/>
+              </w:rPr>
+              <w:t xml:space="preserve">PhenoDist ~ M * S + Condition(EpiVar)</w:t>
+            </w:r>
+          </w:p>
+        </w:tc>
+        <w:tc>
+          <w:tcPr>
+            <w:tcBorders>
+              <w:bottom w:val="none" w:sz="0" w:space="0" w:color="000000"/>
+              <w:top w:val="none" w:sz="0" w:space="0" w:color="000000"/>
+              <w:left w:val="none" w:sz="0" w:space="0" w:color="000000"/>
+              <w:right w:val="none" w:sz="0" w:space="0" w:color="000000"/>
+            </w:tcBorders>
+            <w:shd w:val="clear" w:color="auto" w:fill="FFFFFF"/>
+            <w:tcMar>
+              <w:top w:w="0" w:type="dxa"/>
+              <w:bottom w:w="0" w:type="dxa"/>
+              <w:left w:w="0" w:type="dxa"/>
+              <w:right w:w="0" w:type="dxa"/>
+            </w:tcMar>
+            <w:vAlign w:val="center"/>
+          </w:tcPr>
+          <w:p>
+            <w:pPr>
+              <w:pStyle w:val="Normal"/>
+              <w:jc w:val="right"/>
+              <w:pBdr>
+                <w:bottom w:val="none" w:sz="0" w:space="0" w:color="000000"/>
+                <w:top w:val="none" w:sz="0" w:space="0" w:color="000000"/>
+                <w:left w:val="none" w:sz="0" w:space="0" w:color="000000"/>
+                <w:right w:val="none" w:sz="0" w:space="0" w:color="000000"/>
+              </w:pBdr>
+              <w:spacing w:after="100" w:before="100" w:line="240"/>
+              <w:ind w:left="100" w:right="100" w:firstLine="0" w:firstLineChars="0"/>
+              <w:rPr>
+                <w:rFonts w:ascii="Arial" w:hAnsi="Arial" w:eastAsia="Arial" w:cs="Arial"/>
+                <w:i w:val="false"/>
+                <w:b w:val="false"/>
+                <w:u w:val="none"/>
+                <w:strike w:val="false"/>
+                <w:sz w:val="20"/>
+                <w:szCs w:val="20"/>
+                <w:color w:val="000000"/>
+              </w:rPr>
+            </w:pPr>
+            <w:r>
+              <w:rPr>
+                <w:rFonts w:ascii="Arial" w:hAnsi="Arial" w:eastAsia="Arial" w:cs="Arial"/>
+                <w:i w:val="false"/>
+                <w:b w:val="false"/>
+                <w:u w:val="none"/>
+                <w:strike w:val="false"/>
+                <w:sz w:val="20"/>
+                <w:szCs w:val="20"/>
+                <w:color w:val="000000"/>
+              </w:rPr>
+              <w:t xml:space="preserve">3</w:t>
+            </w:r>
+          </w:p>
+        </w:tc>
+        <w:tc>
+          <w:tcPr>
+            <w:tcBorders>
+              <w:bottom w:val="none" w:sz="0" w:space="0" w:color="000000"/>
+              <w:top w:val="none" w:sz="0" w:space="0" w:color="000000"/>
+              <w:left w:val="none" w:sz="0" w:space="0" w:color="000000"/>
+              <w:right w:val="none" w:sz="0" w:space="0" w:color="000000"/>
+            </w:tcBorders>
+            <w:shd w:val="clear" w:color="auto" w:fill="FFFFFF"/>
+            <w:tcMar>
+              <w:top w:w="0" w:type="dxa"/>
+              <w:bottom w:w="0" w:type="dxa"/>
+              <w:left w:w="0" w:type="dxa"/>
+              <w:right w:w="0" w:type="dxa"/>
+            </w:tcMar>
+            <w:vAlign w:val="center"/>
+          </w:tcPr>
+          <w:p>
+            <w:pPr>
+              <w:pStyle w:val="Normal"/>
+              <w:jc w:val="right"/>
+              <w:pBdr>
+                <w:bottom w:val="none" w:sz="0" w:space="0" w:color="000000"/>
+                <w:top w:val="none" w:sz="0" w:space="0" w:color="000000"/>
+                <w:left w:val="none" w:sz="0" w:space="0" w:color="000000"/>
+                <w:right w:val="none" w:sz="0" w:space="0" w:color="000000"/>
+              </w:pBdr>
+              <w:spacing w:after="100" w:before="100" w:line="240"/>
+              <w:ind w:left="100" w:right="100" w:firstLine="0" w:firstLineChars="0"/>
+              <w:rPr>
+                <w:rFonts w:ascii="Arial" w:hAnsi="Arial" w:eastAsia="Arial" w:cs="Arial"/>
+                <w:i w:val="false"/>
+                <w:b w:val="false"/>
+                <w:u w:val="none"/>
+                <w:strike w:val="false"/>
+                <w:sz w:val="20"/>
+                <w:szCs w:val="20"/>
+                <w:color w:val="000000"/>
+              </w:rPr>
+            </w:pPr>
+            <w:r>
+              <w:rPr>
+                <w:rFonts w:ascii="Arial" w:hAnsi="Arial" w:eastAsia="Arial" w:cs="Arial"/>
+                <w:i w:val="false"/>
+                <w:b w:val="false"/>
+                <w:u w:val="none"/>
+                <w:strike w:val="false"/>
+                <w:sz w:val="20"/>
+                <w:szCs w:val="20"/>
+                <w:color w:val="000000"/>
+              </w:rPr>
+              <w:t xml:space="preserve">6.112</w:t>
+            </w:r>
+          </w:p>
+        </w:tc>
+        <w:tc>
+          <w:tcPr>
+            <w:tcBorders>
+              <w:bottom w:val="none" w:sz="0" w:space="0" w:color="000000"/>
+              <w:top w:val="none" w:sz="0" w:space="0" w:color="000000"/>
+              <w:left w:val="none" w:sz="0" w:space="0" w:color="000000"/>
+              <w:right w:val="none" w:sz="0" w:space="0" w:color="000000"/>
+            </w:tcBorders>
+            <w:shd w:val="clear" w:color="auto" w:fill="FFFFFF"/>
+            <w:tcMar>
+              <w:top w:w="0" w:type="dxa"/>
+              <w:bottom w:w="0" w:type="dxa"/>
+              <w:left w:w="0" w:type="dxa"/>
+              <w:right w:w="0" w:type="dxa"/>
+            </w:tcMar>
+            <w:vAlign w:val="center"/>
+          </w:tcPr>
+          <w:p>
+            <w:pPr>
+              <w:pStyle w:val="Normal"/>
+              <w:jc w:val="left"/>
+              <w:pBdr>
+                <w:bottom w:val="none" w:sz="0" w:space="0" w:color="000000"/>
+                <w:top w:val="none" w:sz="0" w:space="0" w:color="000000"/>
+                <w:left w:val="none" w:sz="0" w:space="0" w:color="000000"/>
+                <w:right w:val="none" w:sz="0" w:space="0" w:color="000000"/>
+              </w:pBdr>
+              <w:spacing w:after="100" w:before="100" w:line="240"/>
+              <w:ind w:left="100" w:right="100" w:firstLine="0" w:firstLineChars="0"/>
+              <w:rPr>
+                <w:rFonts w:ascii="Arial" w:hAnsi="Arial" w:eastAsia="Arial" w:cs="Arial"/>
+                <w:i w:val="false"/>
+                <w:b w:val="false"/>
+                <w:u w:val="none"/>
+                <w:strike w:val="false"/>
+                <w:sz w:val="20"/>
+                <w:szCs w:val="20"/>
+                <w:color w:val="000000"/>
+              </w:rPr>
+            </w:pPr>
+            <w:r>
+              <w:rPr>
+                <w:rFonts w:ascii="Arial" w:hAnsi="Arial" w:eastAsia="Arial" w:cs="Arial"/>
+                <w:i w:val="false"/>
+                <w:b w:val="false"/>
+                <w:u w:val="none"/>
+                <w:strike w:val="false"/>
+                <w:sz w:val="20"/>
+                <w:szCs w:val="20"/>
+                <w:color w:val="000000"/>
+              </w:rPr>
+              <w:t xml:space="preserve">&lt;0.001***</w:t>
+            </w:r>
+          </w:p>
+        </w:tc>
+        <w:tc>
+          <w:tcPr>
+            <w:tcBorders>
+              <w:bottom w:val="none" w:sz="0" w:space="0" w:color="000000"/>
+              <w:top w:val="none" w:sz="0" w:space="0" w:color="000000"/>
+              <w:left w:val="none" w:sz="0" w:space="0" w:color="000000"/>
+              <w:right w:val="none" w:sz="0" w:space="0" w:color="000000"/>
+            </w:tcBorders>
+            <w:shd w:val="clear" w:color="auto" w:fill="FFFFFF"/>
+            <w:tcMar>
+              <w:top w:w="0" w:type="dxa"/>
+              <w:bottom w:w="0" w:type="dxa"/>
+              <w:left w:w="0" w:type="dxa"/>
+              <w:right w:w="0" w:type="dxa"/>
+            </w:tcMar>
+            <w:vAlign w:val="center"/>
+          </w:tcPr>
+          <w:p>
+            <w:pPr>
+              <w:pStyle w:val="Normal"/>
+              <w:jc w:val="right"/>
+              <w:pBdr>
+                <w:bottom w:val="none" w:sz="0" w:space="0" w:color="000000"/>
+                <w:top w:val="none" w:sz="0" w:space="0" w:color="000000"/>
+                <w:left w:val="none" w:sz="0" w:space="0" w:color="000000"/>
+                <w:right w:val="none" w:sz="0" w:space="0" w:color="000000"/>
+              </w:pBdr>
+              <w:spacing w:after="100" w:before="100" w:line="240"/>
+              <w:ind w:left="100" w:right="100" w:firstLine="0" w:firstLineChars="0"/>
+              <w:rPr>
+                <w:rFonts w:ascii="Arial" w:hAnsi="Arial" w:eastAsia="Arial" w:cs="Arial"/>
+                <w:i w:val="false"/>
+                <w:b w:val="false"/>
+                <w:u w:val="none"/>
+                <w:strike w:val="false"/>
+                <w:sz w:val="20"/>
+                <w:szCs w:val="20"/>
+                <w:color w:val="000000"/>
+              </w:rPr>
+            </w:pPr>
+            <w:r>
+              <w:rPr>
+                <w:rFonts w:ascii="Arial" w:hAnsi="Arial" w:eastAsia="Arial" w:cs="Arial"/>
+                <w:i w:val="false"/>
+                <w:b w:val="false"/>
+                <w:u w:val="none"/>
+                <w:strike w:val="false"/>
+                <w:sz w:val="20"/>
+                <w:szCs w:val="20"/>
+                <w:color w:val="000000"/>
+              </w:rPr>
+              <w:t xml:space="preserve">0.274</w:t>
+            </w:r>
+          </w:p>
+        </w:tc>
+      </w:tr>
+      <w:tr>
+        <w:trPr>
+          <w:trHeight w:val="360" w:hRule="auto"/>
+        </w:trPr>
+        <w:tc>
+          <w:tcPr>
+            <w:tcBorders>
+              <w:bottom w:val="none" w:sz="0" w:space="0" w:color="000000"/>
+              <w:top w:val="none" w:sz="0" w:space="0" w:color="000000"/>
+              <w:left w:val="none" w:sz="0" w:space="0" w:color="000000"/>
+              <w:right w:val="none" w:sz="0" w:space="0" w:color="000000"/>
+            </w:tcBorders>
+            <w:shd w:val="clear" w:color="auto" w:fill="FFFFFF"/>
+            <w:tcMar>
+              <w:top w:w="0" w:type="dxa"/>
+              <w:bottom w:w="0" w:type="dxa"/>
+              <w:left w:w="0" w:type="dxa"/>
+              <w:right w:w="0" w:type="dxa"/>
+            </w:tcMar>
+            <w:vAlign w:val="center"/>
+          </w:tcPr>
+          <w:p>
+            <w:pPr>
+              <w:pStyle w:val="Normal"/>
+              <w:jc w:val="left"/>
+              <w:pBdr>
+                <w:bottom w:val="none" w:sz="0" w:space="0" w:color="000000"/>
+                <w:top w:val="none" w:sz="0" w:space="0" w:color="000000"/>
+                <w:left w:val="none" w:sz="0" w:space="0" w:color="000000"/>
+                <w:right w:val="none" w:sz="0" w:space="0" w:color="000000"/>
+              </w:pBdr>
+              <w:spacing w:after="100" w:before="100" w:line="240"/>
+              <w:ind w:left="100" w:right="100" w:firstLine="0" w:firstLineChars="0"/>
+              <w:rPr>
+                <w:rFonts w:ascii="Arial" w:hAnsi="Arial" w:eastAsia="Arial" w:cs="Arial"/>
+                <w:i w:val="false"/>
+                <w:b w:val="false"/>
+                <w:u w:val="none"/>
+                <w:strike w:val="false"/>
+                <w:sz w:val="20"/>
+                <w:szCs w:val="20"/>
+                <w:color w:val="000000"/>
+              </w:rPr>
+            </w:pPr>
+            <w:r>
+              <w:rPr>
+                <w:rFonts w:ascii="Arial" w:hAnsi="Arial" w:eastAsia="Arial" w:cs="Arial"/>
+                <w:i w:val="false"/>
+                <w:b w:val="false"/>
+                <w:u w:val="none"/>
+                <w:strike w:val="false"/>
+                <w:sz w:val="20"/>
+                <w:szCs w:val="20"/>
+                <w:color w:val="000000"/>
+              </w:rPr>
+              <w:t xml:space="preserve">PhenoDist ~ M * S + Condition(GenVar) + Condition(EpiVar)</w:t>
+            </w:r>
+          </w:p>
+        </w:tc>
+        <w:tc>
+          <w:tcPr>
+            <w:tcBorders>
+              <w:bottom w:val="none" w:sz="0" w:space="0" w:color="000000"/>
+              <w:top w:val="none" w:sz="0" w:space="0" w:color="000000"/>
+              <w:left w:val="none" w:sz="0" w:space="0" w:color="000000"/>
+              <w:right w:val="none" w:sz="0" w:space="0" w:color="000000"/>
+            </w:tcBorders>
+            <w:shd w:val="clear" w:color="auto" w:fill="FFFFFF"/>
+            <w:tcMar>
+              <w:top w:w="0" w:type="dxa"/>
+              <w:bottom w:w="0" w:type="dxa"/>
+              <w:left w:w="0" w:type="dxa"/>
+              <w:right w:w="0" w:type="dxa"/>
+            </w:tcMar>
+            <w:vAlign w:val="center"/>
+          </w:tcPr>
+          <w:p>
+            <w:pPr>
+              <w:pStyle w:val="Normal"/>
+              <w:jc w:val="right"/>
+              <w:pBdr>
+                <w:bottom w:val="none" w:sz="0" w:space="0" w:color="000000"/>
+                <w:top w:val="none" w:sz="0" w:space="0" w:color="000000"/>
+                <w:left w:val="none" w:sz="0" w:space="0" w:color="000000"/>
+                <w:right w:val="none" w:sz="0" w:space="0" w:color="000000"/>
+              </w:pBdr>
+              <w:spacing w:after="100" w:before="100" w:line="240"/>
+              <w:ind w:left="100" w:right="100" w:firstLine="0" w:firstLineChars="0"/>
+              <w:rPr>
+                <w:rFonts w:ascii="Arial" w:hAnsi="Arial" w:eastAsia="Arial" w:cs="Arial"/>
+                <w:i w:val="false"/>
+                <w:b w:val="false"/>
+                <w:u w:val="none"/>
+                <w:strike w:val="false"/>
+                <w:sz w:val="20"/>
+                <w:szCs w:val="20"/>
+                <w:color w:val="000000"/>
+              </w:rPr>
+            </w:pPr>
+            <w:r>
+              <w:rPr>
+                <w:rFonts w:ascii="Arial" w:hAnsi="Arial" w:eastAsia="Arial" w:cs="Arial"/>
+                <w:i w:val="false"/>
+                <w:b w:val="false"/>
+                <w:u w:val="none"/>
+                <w:strike w:val="false"/>
+                <w:sz w:val="20"/>
+                <w:szCs w:val="20"/>
+                <w:color w:val="000000"/>
+              </w:rPr>
+              <w:t xml:space="preserve">3</w:t>
+            </w:r>
+          </w:p>
+        </w:tc>
+        <w:tc>
+          <w:tcPr>
+            <w:tcBorders>
+              <w:bottom w:val="none" w:sz="0" w:space="0" w:color="000000"/>
+              <w:top w:val="none" w:sz="0" w:space="0" w:color="000000"/>
+              <w:left w:val="none" w:sz="0" w:space="0" w:color="000000"/>
+              <w:right w:val="none" w:sz="0" w:space="0" w:color="000000"/>
+            </w:tcBorders>
+            <w:shd w:val="clear" w:color="auto" w:fill="FFFFFF"/>
+            <w:tcMar>
+              <w:top w:w="0" w:type="dxa"/>
+              <w:bottom w:w="0" w:type="dxa"/>
+              <w:left w:w="0" w:type="dxa"/>
+              <w:right w:w="0" w:type="dxa"/>
+            </w:tcMar>
+            <w:vAlign w:val="center"/>
+          </w:tcPr>
+          <w:p>
+            <w:pPr>
+              <w:pStyle w:val="Normal"/>
+              <w:jc w:val="right"/>
+              <w:pBdr>
+                <w:bottom w:val="none" w:sz="0" w:space="0" w:color="000000"/>
+                <w:top w:val="none" w:sz="0" w:space="0" w:color="000000"/>
+                <w:left w:val="none" w:sz="0" w:space="0" w:color="000000"/>
+                <w:right w:val="none" w:sz="0" w:space="0" w:color="000000"/>
+              </w:pBdr>
+              <w:spacing w:after="100" w:before="100" w:line="240"/>
+              <w:ind w:left="100" w:right="100" w:firstLine="0" w:firstLineChars="0"/>
+              <w:rPr>
+                <w:rFonts w:ascii="Arial" w:hAnsi="Arial" w:eastAsia="Arial" w:cs="Arial"/>
+                <w:i w:val="false"/>
+                <w:b w:val="false"/>
+                <w:u w:val="none"/>
+                <w:strike w:val="false"/>
+                <w:sz w:val="20"/>
+                <w:szCs w:val="20"/>
+                <w:color w:val="000000"/>
+              </w:rPr>
+            </w:pPr>
+            <w:r>
+              <w:rPr>
+                <w:rFonts w:ascii="Arial" w:hAnsi="Arial" w:eastAsia="Arial" w:cs="Arial"/>
+                <w:i w:val="false"/>
+                <w:b w:val="false"/>
+                <w:u w:val="none"/>
+                <w:strike w:val="false"/>
+                <w:sz w:val="20"/>
+                <w:szCs w:val="20"/>
+                <w:color w:val="000000"/>
+              </w:rPr>
+              <w:t xml:space="preserve">2.274</w:t>
+            </w:r>
+          </w:p>
+        </w:tc>
+        <w:tc>
+          <w:tcPr>
+            <w:tcBorders>
+              <w:bottom w:val="none" w:sz="0" w:space="0" w:color="000000"/>
+              <w:top w:val="none" w:sz="0" w:space="0" w:color="000000"/>
+              <w:left w:val="none" w:sz="0" w:space="0" w:color="000000"/>
+              <w:right w:val="none" w:sz="0" w:space="0" w:color="000000"/>
+            </w:tcBorders>
+            <w:shd w:val="clear" w:color="auto" w:fill="FFFFFF"/>
+            <w:tcMar>
+              <w:top w:w="0" w:type="dxa"/>
+              <w:bottom w:w="0" w:type="dxa"/>
+              <w:left w:w="0" w:type="dxa"/>
+              <w:right w:w="0" w:type="dxa"/>
+            </w:tcMar>
+            <w:vAlign w:val="center"/>
+          </w:tcPr>
+          <w:p>
+            <w:pPr>
+              <w:pStyle w:val="Normal"/>
+              <w:jc w:val="left"/>
+              <w:pBdr>
+                <w:bottom w:val="none" w:sz="0" w:space="0" w:color="000000"/>
+                <w:top w:val="none" w:sz="0" w:space="0" w:color="000000"/>
+                <w:left w:val="none" w:sz="0" w:space="0" w:color="000000"/>
+                <w:right w:val="none" w:sz="0" w:space="0" w:color="000000"/>
+              </w:pBdr>
+              <w:spacing w:after="100" w:before="100" w:line="240"/>
+              <w:ind w:left="100" w:right="100" w:firstLine="0" w:firstLineChars="0"/>
+              <w:rPr>
+                <w:rFonts w:ascii="Arial" w:hAnsi="Arial" w:eastAsia="Arial" w:cs="Arial"/>
+                <w:i w:val="false"/>
+                <w:b w:val="false"/>
+                <w:u w:val="none"/>
+                <w:strike w:val="false"/>
+                <w:sz w:val="20"/>
+                <w:szCs w:val="20"/>
+                <w:color w:val="000000"/>
+              </w:rPr>
+            </w:pPr>
+            <w:r>
+              <w:rPr>
+                <w:rFonts w:ascii="Arial" w:hAnsi="Arial" w:eastAsia="Arial" w:cs="Arial"/>
+                <w:i w:val="false"/>
+                <w:b w:val="false"/>
+                <w:u w:val="none"/>
+                <w:strike w:val="false"/>
+                <w:sz w:val="20"/>
+                <w:szCs w:val="20"/>
+                <w:color w:val="000000"/>
+              </w:rPr>
+              <w:t xml:space="preserve">&lt;0.001***</w:t>
+            </w:r>
+          </w:p>
+        </w:tc>
+        <w:tc>
+          <w:tcPr>
+            <w:tcBorders>
+              <w:bottom w:val="none" w:sz="0" w:space="0" w:color="000000"/>
+              <w:top w:val="none" w:sz="0" w:space="0" w:color="000000"/>
+              <w:left w:val="none" w:sz="0" w:space="0" w:color="000000"/>
+              <w:right w:val="none" w:sz="0" w:space="0" w:color="000000"/>
+            </w:tcBorders>
+            <w:shd w:val="clear" w:color="auto" w:fill="FFFFFF"/>
+            <w:tcMar>
+              <w:top w:w="0" w:type="dxa"/>
+              <w:bottom w:w="0" w:type="dxa"/>
+              <w:left w:w="0" w:type="dxa"/>
+              <w:right w:w="0" w:type="dxa"/>
+            </w:tcMar>
+            <w:vAlign w:val="center"/>
+          </w:tcPr>
+          <w:p>
+            <w:pPr>
+              <w:pStyle w:val="Normal"/>
+              <w:jc w:val="right"/>
+              <w:pBdr>
+                <w:bottom w:val="none" w:sz="0" w:space="0" w:color="000000"/>
+                <w:top w:val="none" w:sz="0" w:space="0" w:color="000000"/>
+                <w:left w:val="none" w:sz="0" w:space="0" w:color="000000"/>
+                <w:right w:val="none" w:sz="0" w:space="0" w:color="000000"/>
+              </w:pBdr>
+              <w:spacing w:after="100" w:before="100" w:line="240"/>
+              <w:ind w:left="100" w:right="100" w:firstLine="0" w:firstLineChars="0"/>
+              <w:rPr>
+                <w:rFonts w:ascii="Arial" w:hAnsi="Arial" w:eastAsia="Arial" w:cs="Arial"/>
+                <w:i w:val="false"/>
+                <w:b w:val="false"/>
+                <w:u w:val="none"/>
+                <w:strike w:val="false"/>
+                <w:sz w:val="20"/>
+                <w:szCs w:val="20"/>
+                <w:color w:val="000000"/>
+              </w:rPr>
+            </w:pPr>
+            <w:r>
+              <w:rPr>
+                <w:rFonts w:ascii="Arial" w:hAnsi="Arial" w:eastAsia="Arial" w:cs="Arial"/>
+                <w:i w:val="false"/>
+                <w:b w:val="false"/>
+                <w:u w:val="none"/>
+                <w:strike w:val="false"/>
+                <w:sz w:val="20"/>
+                <w:szCs w:val="20"/>
+                <w:color w:val="000000"/>
+              </w:rPr>
+              <w:t xml:space="preserve">0.074</w:t>
+            </w:r>
+          </w:p>
+        </w:tc>
+      </w:tr>
+      <w:tr>
+        <w:trPr>
+          <w:trHeight w:val="360" w:hRule="auto"/>
+        </w:trPr>
+        <w:tc>
+          <w:tcPr>
+            <w:tcBorders>
               <w:bottom w:val="single" w:sz="12" w:space="0" w:color="666666"/>
               <w:top w:val="none" w:sz="0" w:space="0" w:color="000000"/>
               <w:left w:val="none" w:sz="0" w:space="0" w:color="000000"/>
@@ -13078,7 +14478,7 @@
                 <w:szCs w:val="20"/>
                 <w:color w:val="000000"/>
               </w:rPr>
-              <w:t xml:space="preserve">17.065</w:t>
+              <w:t xml:space="preserve">17.064</w:t>
             </w:r>
           </w:p>
         </w:tc>
@@ -14151,7 +15551,7 @@
                 <w:szCs w:val="20"/>
                 <w:color w:val="000000"/>
               </w:rPr>
-              <w:t xml:space="preserve">0.003**</w:t>
+              <w:t xml:space="preserve">0.002**</w:t>
             </w:r>
           </w:p>
         </w:tc>
@@ -14474,7 +15874,7 @@
                 <w:szCs w:val="20"/>
                 <w:color w:val="000000"/>
               </w:rPr>
-              <w:t xml:space="preserve">0.110</w:t>
+              <w:t xml:space="preserve">0.104</w:t>
             </w:r>
           </w:p>
         </w:tc>

</xml_diff>